<commit_message>
Refresh application operating report with hybrid AI recipes and export packs.
Rebuild Markdown, Word, PowerPoint, and PDF for report 19 with three-officer-tools summary, updated Vitest/pytest/E2E counts, and regenerated architecture diagrams.
</commit_message>
<xml_diff>
--- a/Discussions/19-APPLICATION_OPERATING_REPORT.docx
+++ b/Discussions/19-APPLICATION_OPERATING_REPORT.docx
@@ -70,7 +70,7 @@
           <w:color w:val="1F2A37"/>
           <w:sz w:val="28"/>
         </w:rPr>
-        <w:t>แหล่งความจริง: โค้ดใน app/frontend และ app/backend รวมผล unit tests ที่รันจริงวันเดียวกัน (Vitest 122 ผ่าน, pytest 1448 ผ่าน) เอกสารนี้เป็นฉบับส่งออกของ Discussions/19-APPLICATION_OPERATING_REPORT.md</w:t>
+        <w:t>แหล่งความจริง: โค้ดใน app/frontend และ app/backend รวมผล unit tests ที่รันจริงวันเดียวกัน (Vitest 128 ผ่าน, pytest 1448 + live_llm 10, Playwright headed 15) เอกสารนี้เป็นฉบับส่งออกของ Discussions/19-APPLICATION_OPERATING_REPORT.md</w:t>
       </w:r>
     </w:p>
     <w:p>
@@ -504,7 +504,7 @@
                 <w:color w:val="1F2A37"/>
                 <w:sz w:val="24"/>
               </w:rPr>
-              <w:t>Vitest 122 ผ่าน · pytest 1448 ผ่าน (ข้าม live_llm 10 เคส)</w:t>
+              <w:t>Vitest 128 · pytest 1448 + live_llm 10 · Playwright headed 15</w:t>
             </w:r>
           </w:p>
         </w:tc>
@@ -1463,7 +1463,7 @@
       <w:r>
         <w:drawing>
           <wp:inline xmlns:a="http://schemas.openxmlformats.org/drawingml/2006/main" xmlns:pic="http://schemas.openxmlformats.org/drawingml/2006/picture">
-            <wp:extent cx="5760000" cy="6992000"/>
+            <wp:extent cx="5760000" cy="3600000"/>
             <wp:docPr id="3" name="Picture 3"/>
             <wp:cNvGraphicFramePr>
               <a:graphicFrameLocks noChangeAspect="1"/>
@@ -1484,7 +1484,7 @@
                   <pic:spPr>
                     <a:xfrm>
                       <a:off x="0" y="0"/>
-                      <a:ext cx="5760000" cy="6992000"/>
+                      <a:ext cx="5760000" cy="3600000"/>
                     </a:xfrm>
                     <a:prstGeom prst="rect"/>
                   </pic:spPr>
@@ -1510,6 +1510,379 @@
         <w:t>ภาพที่ 3  แดชบอร์ดหลังล็อกอิน</w:t>
       </w:r>
     </w:p>
+    <w:p>
+      <w:pPr>
+        <w:pStyle w:val="Heading2"/>
+      </w:pPr>
+      <w:r>
+        <w:rPr>
+          <w:rFonts w:ascii="TH Sarabun New" w:hAnsi="TH Sarabun New" w:cs="TH Sarabun New" w:eastAsia="TH Sarabun New"/>
+          <w:b/>
+          <w:color w:val="1D408C"/>
+          <w:sz w:val="32"/>
+        </w:rPr>
+        <w:t>2.1 สามเครื่องมือหลักของเจ้าหน้าที่</w:t>
+      </w:r>
+    </w:p>
+    <w:tbl>
+      <w:tblPr>
+        <w:tblStyle w:val="TableGrid"/>
+        <w:tblW w:type="auto" w:w="0"/>
+        <w:jc w:val="center"/>
+        <w:tblLook w:firstColumn="1" w:firstRow="1" w:lastColumn="0" w:lastRow="0" w:noHBand="0" w:noVBand="1" w:val="04A0"/>
+      </w:tblPr>
+      <w:tblGrid>
+        <w:gridCol w:w="2353"/>
+        <w:gridCol w:w="2353"/>
+        <w:gridCol w:w="2353"/>
+        <w:gridCol w:w="2353"/>
+      </w:tblGrid>
+      <w:tr>
+        <w:tc>
+          <w:tcPr>
+            <w:tcW w:type="dxa" w:w="2353"/>
+            <w:shd w:fill="1D408C" w:val="clear"/>
+          </w:tcPr>
+          <w:p>
+            <w:pPr>
+              <w:spacing w:after="0"/>
+            </w:pPr>
+            <w:r/>
+            <w:r>
+              <w:rPr>
+                <w:rFonts w:ascii="TH Sarabun New" w:hAnsi="TH Sarabun New" w:cs="TH Sarabun New" w:eastAsia="TH Sarabun New"/>
+                <w:b/>
+                <w:color w:val="FFFFFF"/>
+                <w:sz w:val="24"/>
+              </w:rPr>
+              <w:t>เครื่องมือ</w:t>
+            </w:r>
+          </w:p>
+        </w:tc>
+        <w:tc>
+          <w:tcPr>
+            <w:tcW w:type="dxa" w:w="2353"/>
+            <w:shd w:fill="1D408C" w:val="clear"/>
+          </w:tcPr>
+          <w:p>
+            <w:pPr>
+              <w:spacing w:after="0"/>
+            </w:pPr>
+            <w:r/>
+            <w:r>
+              <w:rPr>
+                <w:rFonts w:ascii="TH Sarabun New" w:hAnsi="TH Sarabun New" w:cs="TH Sarabun New" w:eastAsia="TH Sarabun New"/>
+                <w:b/>
+                <w:color w:val="FFFFFF"/>
+                <w:sz w:val="24"/>
+              </w:rPr>
+              <w:t>หน้า</w:t>
+            </w:r>
+          </w:p>
+        </w:tc>
+        <w:tc>
+          <w:tcPr>
+            <w:tcW w:type="dxa" w:w="2353"/>
+            <w:shd w:fill="1D408C" w:val="clear"/>
+          </w:tcPr>
+          <w:p>
+            <w:pPr>
+              <w:spacing w:after="0"/>
+            </w:pPr>
+            <w:r/>
+            <w:r>
+              <w:rPr>
+                <w:rFonts w:ascii="TH Sarabun New" w:hAnsi="TH Sarabun New" w:cs="TH Sarabun New" w:eastAsia="TH Sarabun New"/>
+                <w:b/>
+                <w:color w:val="FFFFFF"/>
+                <w:sz w:val="24"/>
+              </w:rPr>
+              <w:t>ทำอะไร</w:t>
+            </w:r>
+          </w:p>
+        </w:tc>
+        <w:tc>
+          <w:tcPr>
+            <w:tcW w:type="dxa" w:w="2353"/>
+            <w:shd w:fill="1D408C" w:val="clear"/>
+          </w:tcPr>
+          <w:p>
+            <w:pPr>
+              <w:spacing w:after="0"/>
+            </w:pPr>
+            <w:r/>
+            <w:r>
+              <w:rPr>
+                <w:rFonts w:ascii="TH Sarabun New" w:hAnsi="TH Sarabun New" w:cs="TH Sarabun New" w:eastAsia="TH Sarabun New"/>
+                <w:b/>
+                <w:color w:val="FFFFFF"/>
+                <w:sz w:val="24"/>
+              </w:rPr>
+              <w:t>ผลที่ควรเห็น</w:t>
+            </w:r>
+          </w:p>
+        </w:tc>
+      </w:tr>
+      <w:tr>
+        <w:tc>
+          <w:tcPr>
+            <w:tcW w:type="dxa" w:w="2353"/>
+            <w:shd w:fill="FFFFFF" w:val="clear"/>
+          </w:tcPr>
+          <w:p>
+            <w:pPr>
+              <w:spacing w:after="0"/>
+            </w:pPr>
+            <w:r/>
+            <w:r>
+              <w:rPr>
+                <w:rFonts w:ascii="TH Sarabun New" w:hAnsi="TH Sarabun New" w:cs="TH Sarabun New" w:eastAsia="TH Sarabun New"/>
+                <w:b w:val="0"/>
+                <w:color w:val="1F2A37"/>
+                <w:sz w:val="24"/>
+              </w:rPr>
+              <w:t>ร่าง TOR</w:t>
+            </w:r>
+          </w:p>
+        </w:tc>
+        <w:tc>
+          <w:tcPr>
+            <w:tcW w:type="dxa" w:w="2353"/>
+            <w:shd w:fill="FFFFFF" w:val="clear"/>
+          </w:tcPr>
+          <w:p>
+            <w:pPr>
+              <w:spacing w:after="0"/>
+            </w:pPr>
+            <w:r/>
+            <w:r>
+              <w:rPr>
+                <w:rFonts w:ascii="TH Sarabun New" w:hAnsi="TH Sarabun New" w:cs="TH Sarabun New" w:eastAsia="TH Sarabun New"/>
+                <w:b w:val="0"/>
+                <w:color w:val="1F2A37"/>
+                <w:sz w:val="24"/>
+              </w:rPr>
+              <w:t>/projects/{id}/draft</w:t>
+            </w:r>
+          </w:p>
+        </w:tc>
+        <w:tc>
+          <w:tcPr>
+            <w:tcW w:type="dxa" w:w="2353"/>
+            <w:shd w:fill="FFFFFF" w:val="clear"/>
+          </w:tcPr>
+          <w:p>
+            <w:pPr>
+              <w:spacing w:after="0"/>
+            </w:pPr>
+            <w:r/>
+            <w:r>
+              <w:rPr>
+                <w:rFonts w:ascii="TH Sarabun New" w:hAnsi="TH Sarabun New" w:cs="TH Sarabun New" w:eastAsia="TH Sarabun New"/>
+                <w:b w:val="0"/>
+                <w:color w:val="1F2A37"/>
+                <w:sz w:val="24"/>
+              </w:rPr>
+              <w:t>5 Phase: อัปโหลด → เติมช่อง → ร่าง 13 หมวด (+ AI) → HITL</w:t>
+            </w:r>
+          </w:p>
+        </w:tc>
+        <w:tc>
+          <w:tcPr>
+            <w:tcW w:type="dxa" w:w="2353"/>
+            <w:shd w:fill="FFFFFF" w:val="clear"/>
+          </w:tcPr>
+          <w:p>
+            <w:pPr>
+              <w:spacing w:after="0"/>
+            </w:pPr>
+            <w:r/>
+            <w:r>
+              <w:rPr>
+                <w:rFonts w:ascii="TH Sarabun New" w:hAnsi="TH Sarabun New" w:cs="TH Sarabun New" w:eastAsia="TH Sarabun New"/>
+                <w:b w:val="0"/>
+                <w:color w:val="1F2A37"/>
+                <w:sz w:val="24"/>
+              </w:rPr>
+              <w:t>มีเนื้อหา s1–s13 พร้อมส่งตรวจ</w:t>
+            </w:r>
+          </w:p>
+        </w:tc>
+      </w:tr>
+      <w:tr>
+        <w:tc>
+          <w:tcPr>
+            <w:tcW w:type="dxa" w:w="2353"/>
+            <w:shd w:fill="F4F7FB" w:val="clear"/>
+          </w:tcPr>
+          <w:p>
+            <w:pPr>
+              <w:spacing w:after="0"/>
+            </w:pPr>
+            <w:r/>
+            <w:r>
+              <w:rPr>
+                <w:rFonts w:ascii="TH Sarabun New" w:hAnsi="TH Sarabun New" w:cs="TH Sarabun New" w:eastAsia="TH Sarabun New"/>
+                <w:b w:val="0"/>
+                <w:color w:val="1F2A37"/>
+                <w:sz w:val="24"/>
+              </w:rPr>
+              <w:t>ตรวจสอบ TOR</w:t>
+            </w:r>
+          </w:p>
+        </w:tc>
+        <w:tc>
+          <w:tcPr>
+            <w:tcW w:type="dxa" w:w="2353"/>
+            <w:shd w:fill="F4F7FB" w:val="clear"/>
+          </w:tcPr>
+          <w:p>
+            <w:pPr>
+              <w:spacing w:after="0"/>
+            </w:pPr>
+            <w:r/>
+            <w:r>
+              <w:rPr>
+                <w:rFonts w:ascii="TH Sarabun New" w:hAnsi="TH Sarabun New" w:cs="TH Sarabun New" w:eastAsia="TH Sarabun New"/>
+                <w:b w:val="0"/>
+                <w:color w:val="1F2A37"/>
+                <w:sz w:val="24"/>
+              </w:rPr>
+              <w:t>Phase 3 + /review</w:t>
+            </w:r>
+          </w:p>
+        </w:tc>
+        <w:tc>
+          <w:tcPr>
+            <w:tcW w:type="dxa" w:w="2353"/>
+            <w:shd w:fill="F4F7FB" w:val="clear"/>
+          </w:tcPr>
+          <w:p>
+            <w:pPr>
+              <w:spacing w:after="0"/>
+            </w:pPr>
+            <w:r/>
+            <w:r>
+              <w:rPr>
+                <w:rFonts w:ascii="TH Sarabun New" w:hAnsi="TH Sarabun New" w:cs="TH Sarabun New" w:eastAsia="TH Sarabun New"/>
+                <w:b w:val="0"/>
+                <w:color w:val="1F2A37"/>
+                <w:sz w:val="24"/>
+              </w:rPr>
+              <w:t>Rule Engine ≥ 70 + ReviewAgent · ตรวจไฟล์ภายนอก</w:t>
+            </w:r>
+          </w:p>
+        </w:tc>
+        <w:tc>
+          <w:tcPr>
+            <w:tcW w:type="dxa" w:w="2353"/>
+            <w:shd w:fill="F4F7FB" w:val="clear"/>
+          </w:tcPr>
+          <w:p>
+            <w:pPr>
+              <w:spacing w:after="0"/>
+            </w:pPr>
+            <w:r/>
+            <w:r>
+              <w:rPr>
+                <w:rFonts w:ascii="TH Sarabun New" w:hAnsi="TH Sarabun New" w:cs="TH Sarabun New" w:eastAsia="TH Sarabun New"/>
+                <w:b w:val="0"/>
+                <w:color w:val="1F2A37"/>
+                <w:sz w:val="24"/>
+              </w:rPr>
+              <w:t>คะแนน / findings / suggestions</w:t>
+            </w:r>
+          </w:p>
+        </w:tc>
+      </w:tr>
+      <w:tr>
+        <w:tc>
+          <w:tcPr>
+            <w:tcW w:type="dxa" w:w="2353"/>
+            <w:shd w:fill="FFFFFF" w:val="clear"/>
+          </w:tcPr>
+          <w:p>
+            <w:pPr>
+              <w:spacing w:after="0"/>
+            </w:pPr>
+            <w:r/>
+            <w:r>
+              <w:rPr>
+                <w:rFonts w:ascii="TH Sarabun New" w:hAnsi="TH Sarabun New" w:cs="TH Sarabun New" w:eastAsia="TH Sarabun New"/>
+                <w:b w:val="0"/>
+                <w:color w:val="1F2A37"/>
+                <w:sz w:val="24"/>
+              </w:rPr>
+              <w:t>ถาม-ตอบ</w:t>
+            </w:r>
+          </w:p>
+        </w:tc>
+        <w:tc>
+          <w:tcPr>
+            <w:tcW w:type="dxa" w:w="2353"/>
+            <w:shd w:fill="FFFFFF" w:val="clear"/>
+          </w:tcPr>
+          <w:p>
+            <w:pPr>
+              <w:spacing w:after="0"/>
+            </w:pPr>
+            <w:r/>
+            <w:r>
+              <w:rPr>
+                <w:rFonts w:ascii="TH Sarabun New" w:hAnsi="TH Sarabun New" w:cs="TH Sarabun New" w:eastAsia="TH Sarabun New"/>
+                <w:b w:val="0"/>
+                <w:color w:val="1F2A37"/>
+                <w:sz w:val="24"/>
+              </w:rPr>
+              <w:t>/chat</w:t>
+            </w:r>
+          </w:p>
+        </w:tc>
+        <w:tc>
+          <w:tcPr>
+            <w:tcW w:type="dxa" w:w="2353"/>
+            <w:shd w:fill="FFFFFF" w:val="clear"/>
+          </w:tcPr>
+          <w:p>
+            <w:pPr>
+              <w:spacing w:after="0"/>
+            </w:pPr>
+            <w:r/>
+            <w:r>
+              <w:rPr>
+                <w:rFonts w:ascii="TH Sarabun New" w:hAnsi="TH Sarabun New" w:cs="TH Sarabun New" w:eastAsia="TH Sarabun New"/>
+                <w:b w:val="0"/>
+                <w:color w:val="1F2A37"/>
+                <w:sz w:val="24"/>
+              </w:rPr>
+              <w:t>ห้องคลังความรู้ SSE + citations จาก RAG</w:t>
+            </w:r>
+          </w:p>
+        </w:tc>
+        <w:tc>
+          <w:tcPr>
+            <w:tcW w:type="dxa" w:w="2353"/>
+            <w:shd w:fill="FFFFFF" w:val="clear"/>
+          </w:tcPr>
+          <w:p>
+            <w:pPr>
+              <w:spacing w:after="0"/>
+            </w:pPr>
+            <w:r/>
+            <w:r>
+              <w:rPr>
+                <w:rFonts w:ascii="TH Sarabun New" w:hAnsi="TH Sarabun New" w:cs="TH Sarabun New" w:eastAsia="TH Sarabun New"/>
+                <w:b w:val="0"/>
+                <w:color w:val="1F2A37"/>
+                <w:sz w:val="24"/>
+              </w:rPr>
+              <w:t>คำตอบยาวพร้อมชิปอ้างอิง</w:t>
+            </w:r>
+          </w:p>
+        </w:tc>
+      </w:tr>
+    </w:tbl>
+    <w:p/>
     <w:p>
       <w:pPr>
         <w:pStyle w:val="Heading1"/>
@@ -5058,7 +5431,7 @@
       <w:r>
         <w:drawing>
           <wp:inline xmlns:a="http://schemas.openxmlformats.org/drawingml/2006/main" xmlns:pic="http://schemas.openxmlformats.org/drawingml/2006/picture">
-            <wp:extent cx="5760000" cy="9584000"/>
+            <wp:extent cx="5760000" cy="9648505"/>
             <wp:docPr id="5" name="Picture 5"/>
             <wp:cNvGraphicFramePr>
               <a:graphicFrameLocks noChangeAspect="1"/>
@@ -5079,7 +5452,7 @@
                   <pic:spPr>
                     <a:xfrm>
                       <a:off x="0" y="0"/>
-                      <a:ext cx="5760000" cy="9584000"/>
+                      <a:ext cx="5760000" cy="9648505"/>
                     </a:xfrm>
                     <a:prstGeom prst="rect"/>
                   </pic:spPr>
@@ -5112,7 +5485,7 @@
       <w:r>
         <w:drawing>
           <wp:inline xmlns:a="http://schemas.openxmlformats.org/drawingml/2006/main" xmlns:pic="http://schemas.openxmlformats.org/drawingml/2006/picture">
-            <wp:extent cx="5760000" cy="7044000"/>
+            <wp:extent cx="5760000" cy="7110063"/>
             <wp:docPr id="6" name="Picture 6"/>
             <wp:cNvGraphicFramePr>
               <a:graphicFrameLocks noChangeAspect="1"/>
@@ -5133,7 +5506,7 @@
                   <pic:spPr>
                     <a:xfrm>
                       <a:off x="0" y="0"/>
-                      <a:ext cx="5760000" cy="7044000"/>
+                      <a:ext cx="5760000" cy="7110063"/>
                     </a:xfrm>
                     <a:prstGeom prst="rect"/>
                   </pic:spPr>
@@ -6320,7 +6693,7 @@
       <w:r>
         <w:drawing>
           <wp:inline xmlns:a="http://schemas.openxmlformats.org/drawingml/2006/main" xmlns:pic="http://schemas.openxmlformats.org/drawingml/2006/picture">
-            <wp:extent cx="5760000" cy="3988000"/>
+            <wp:extent cx="5760000" cy="4478653"/>
             <wp:docPr id="13" name="Picture 13"/>
             <wp:cNvGraphicFramePr>
               <a:graphicFrameLocks noChangeAspect="1"/>
@@ -6341,7 +6714,7 @@
                   <pic:spPr>
                     <a:xfrm>
                       <a:off x="0" y="0"/>
-                      <a:ext cx="5760000" cy="3988000"/>
+                      <a:ext cx="5760000" cy="4478653"/>
                     </a:xfrm>
                     <a:prstGeom prst="rect"/>
                   </pic:spPr>
@@ -6374,7 +6747,7 @@
       <w:r>
         <w:drawing>
           <wp:inline xmlns:a="http://schemas.openxmlformats.org/drawingml/2006/main" xmlns:pic="http://schemas.openxmlformats.org/drawingml/2006/picture">
-            <wp:extent cx="5760000" cy="5868000"/>
+            <wp:extent cx="5760000" cy="5925726"/>
             <wp:docPr id="14" name="Picture 14"/>
             <wp:cNvGraphicFramePr>
               <a:graphicFrameLocks noChangeAspect="1"/>
@@ -6395,7 +6768,7 @@
                   <pic:spPr>
                     <a:xfrm>
                       <a:off x="0" y="0"/>
-                      <a:ext cx="5760000" cy="5868000"/>
+                      <a:ext cx="5760000" cy="5925726"/>
                     </a:xfrm>
                     <a:prstGeom prst="rect"/>
                   </pic:spPr>
@@ -9754,6 +10127,365 @@
                 <w:sz w:val="24"/>
               </w:rPr>
               <w:t>pgvector (ค่าเริ่ม) หรือ qdrant</w:t>
+            </w:r>
+          </w:p>
+        </w:tc>
+      </w:tr>
+    </w:tbl>
+    <w:p/>
+    <w:tbl>
+      <w:tblPr>
+        <w:tblStyle w:val="TableGrid"/>
+        <w:tblW w:type="auto" w:w="0"/>
+        <w:jc w:val="center"/>
+        <w:tblLook w:firstColumn="1" w:firstRow="1" w:lastColumn="0" w:lastRow="0" w:noHBand="0" w:noVBand="1" w:val="04A0"/>
+      </w:tblPr>
+      <w:tblGrid>
+        <w:gridCol w:w="2353"/>
+        <w:gridCol w:w="2353"/>
+        <w:gridCol w:w="2353"/>
+        <w:gridCol w:w="2353"/>
+      </w:tblGrid>
+      <w:tr>
+        <w:tc>
+          <w:tcPr>
+            <w:tcW w:type="dxa" w:w="2353"/>
+            <w:shd w:fill="1D408C" w:val="clear"/>
+          </w:tcPr>
+          <w:p>
+            <w:pPr>
+              <w:spacing w:after="0"/>
+            </w:pPr>
+            <w:r/>
+            <w:r>
+              <w:rPr>
+                <w:rFonts w:ascii="TH Sarabun New" w:hAnsi="TH Sarabun New" w:cs="TH Sarabun New" w:eastAsia="TH Sarabun New"/>
+                <w:b/>
+                <w:color w:val="FFFFFF"/>
+                <w:sz w:val="24"/>
+              </w:rPr>
+              <w:t>เป้าหมายการตั้งค่า</w:t>
+            </w:r>
+          </w:p>
+        </w:tc>
+        <w:tc>
+          <w:tcPr>
+            <w:tcW w:type="dxa" w:w="2353"/>
+            <w:shd w:fill="1D408C" w:val="clear"/>
+          </w:tcPr>
+          <w:p>
+            <w:pPr>
+              <w:spacing w:after="0"/>
+            </w:pPr>
+            <w:r/>
+            <w:r>
+              <w:rPr>
+                <w:rFonts w:ascii="TH Sarabun New" w:hAnsi="TH Sarabun New" w:cs="TH Sarabun New" w:eastAsia="TH Sarabun New"/>
+                <w:b/>
+                <w:color w:val="FFFFFF"/>
+                <w:sz w:val="24"/>
+              </w:rPr>
+              <w:t>แชท</w:t>
+            </w:r>
+          </w:p>
+        </w:tc>
+        <w:tc>
+          <w:tcPr>
+            <w:tcW w:type="dxa" w:w="2353"/>
+            <w:shd w:fill="1D408C" w:val="clear"/>
+          </w:tcPr>
+          <w:p>
+            <w:pPr>
+              <w:spacing w:after="0"/>
+            </w:pPr>
+            <w:r/>
+            <w:r>
+              <w:rPr>
+                <w:rFonts w:ascii="TH Sarabun New" w:hAnsi="TH Sarabun New" w:cs="TH Sarabun New" w:eastAsia="TH Sarabun New"/>
+                <w:b/>
+                <w:color w:val="FFFFFF"/>
+                <w:sz w:val="24"/>
+              </w:rPr>
+              <w:t>ฝังเวกเตอร์</w:t>
+            </w:r>
+          </w:p>
+        </w:tc>
+        <w:tc>
+          <w:tcPr>
+            <w:tcW w:type="dxa" w:w="2353"/>
+            <w:shd w:fill="1D408C" w:val="clear"/>
+          </w:tcPr>
+          <w:p>
+            <w:pPr>
+              <w:spacing w:after="0"/>
+            </w:pPr>
+            <w:r/>
+            <w:r>
+              <w:rPr>
+                <w:rFonts w:ascii="TH Sarabun New" w:hAnsi="TH Sarabun New" w:cs="TH Sarabun New" w:eastAsia="TH Sarabun New"/>
+                <w:b/>
+                <w:color w:val="FFFFFF"/>
+                <w:sz w:val="24"/>
+              </w:rPr>
+              <w:t>หมายเหตุ</w:t>
+            </w:r>
+          </w:p>
+        </w:tc>
+      </w:tr>
+      <w:tr>
+        <w:tc>
+          <w:tcPr>
+            <w:tcW w:type="dxa" w:w="2353"/>
+            <w:shd w:fill="FFFFFF" w:val="clear"/>
+          </w:tcPr>
+          <w:p>
+            <w:pPr>
+              <w:spacing w:after="0"/>
+            </w:pPr>
+            <w:r/>
+            <w:r>
+              <w:rPr>
+                <w:rFonts w:ascii="TH Sarabun New" w:hAnsi="TH Sarabun New" w:cs="TH Sarabun New" w:eastAsia="TH Sarabun New"/>
+                <w:b w:val="0"/>
+                <w:color w:val="1F2A37"/>
+                <w:sz w:val="24"/>
+              </w:rPr>
+              <w:t>ค่าเริ่มต้นในเครื่อง</w:t>
+            </w:r>
+          </w:p>
+        </w:tc>
+        <w:tc>
+          <w:tcPr>
+            <w:tcW w:type="dxa" w:w="2353"/>
+            <w:shd w:fill="FFFFFF" w:val="clear"/>
+          </w:tcPr>
+          <w:p>
+            <w:pPr>
+              <w:spacing w:after="0"/>
+            </w:pPr>
+            <w:r/>
+            <w:r>
+              <w:rPr>
+                <w:rFonts w:ascii="TH Sarabun New" w:hAnsi="TH Sarabun New" w:cs="TH Sarabun New" w:eastAsia="TH Sarabun New"/>
+                <w:b w:val="0"/>
+                <w:color w:val="1F2A37"/>
+                <w:sz w:val="24"/>
+              </w:rPr>
+              <w:t>LM Studio (Gemma)</w:t>
+            </w:r>
+          </w:p>
+        </w:tc>
+        <w:tc>
+          <w:tcPr>
+            <w:tcW w:type="dxa" w:w="2353"/>
+            <w:shd w:fill="FFFFFF" w:val="clear"/>
+          </w:tcPr>
+          <w:p>
+            <w:pPr>
+              <w:spacing w:after="0"/>
+            </w:pPr>
+            <w:r/>
+            <w:r>
+              <w:rPr>
+                <w:rFonts w:ascii="TH Sarabun New" w:hAnsi="TH Sarabun New" w:cs="TH Sarabun New" w:eastAsia="TH Sarabun New"/>
+                <w:b w:val="0"/>
+                <w:color w:val="1F2A37"/>
+                <w:sz w:val="24"/>
+              </w:rPr>
+              <w:t>EmbeddingGemma</w:t>
+            </w:r>
+          </w:p>
+        </w:tc>
+        <w:tc>
+          <w:tcPr>
+            <w:tcW w:type="dxa" w:w="2353"/>
+            <w:shd w:fill="FFFFFF" w:val="clear"/>
+          </w:tcPr>
+          <w:p>
+            <w:pPr>
+              <w:spacing w:after="0"/>
+            </w:pPr>
+            <w:r/>
+            <w:r>
+              <w:rPr>
+                <w:rFonts w:ascii="TH Sarabun New" w:hAnsi="TH Sarabun New" w:cs="TH Sarabun New" w:eastAsia="TH Sarabun New"/>
+                <w:b w:val="0"/>
+                <w:color w:val="1F2A37"/>
+                <w:sz w:val="24"/>
+              </w:rPr>
+              <w:t>โหลดทั้งสองที่พอร์ต 1234</w:t>
+            </w:r>
+          </w:p>
+        </w:tc>
+      </w:tr>
+      <w:tr>
+        <w:tc>
+          <w:tcPr>
+            <w:tcW w:type="dxa" w:w="2353"/>
+            <w:shd w:fill="F4F7FB" w:val="clear"/>
+          </w:tcPr>
+          <w:p>
+            <w:pPr>
+              <w:spacing w:after="0"/>
+            </w:pPr>
+            <w:r/>
+            <w:r>
+              <w:rPr>
+                <w:rFonts w:ascii="TH Sarabun New" w:hAnsi="TH Sarabun New" w:cs="TH Sarabun New" w:eastAsia="TH Sarabun New"/>
+                <w:b w:val="0"/>
+                <w:color w:val="1F2A37"/>
+                <w:sz w:val="24"/>
+              </w:rPr>
+              <w:t>Claude + ฝังเวกเตอร์ในเครื่อง</w:t>
+            </w:r>
+          </w:p>
+        </w:tc>
+        <w:tc>
+          <w:tcPr>
+            <w:tcW w:type="dxa" w:w="2353"/>
+            <w:shd w:fill="F4F7FB" w:val="clear"/>
+          </w:tcPr>
+          <w:p>
+            <w:pPr>
+              <w:spacing w:after="0"/>
+            </w:pPr>
+            <w:r/>
+            <w:r>
+              <w:rPr>
+                <w:rFonts w:ascii="TH Sarabun New" w:hAnsi="TH Sarabun New" w:cs="TH Sarabun New" w:eastAsia="TH Sarabun New"/>
+                <w:b w:val="0"/>
+                <w:color w:val="1F2A37"/>
+                <w:sz w:val="24"/>
+              </w:rPr>
+              <w:t>Claude</w:t>
+            </w:r>
+          </w:p>
+        </w:tc>
+        <w:tc>
+          <w:tcPr>
+            <w:tcW w:type="dxa" w:w="2353"/>
+            <w:shd w:fill="F4F7FB" w:val="clear"/>
+          </w:tcPr>
+          <w:p>
+            <w:pPr>
+              <w:spacing w:after="0"/>
+            </w:pPr>
+            <w:r/>
+            <w:r>
+              <w:rPr>
+                <w:rFonts w:ascii="TH Sarabun New" w:hAnsi="TH Sarabun New" w:cs="TH Sarabun New" w:eastAsia="TH Sarabun New"/>
+                <w:b w:val="0"/>
+                <w:color w:val="1F2A37"/>
+                <w:sz w:val="24"/>
+              </w:rPr>
+              <w:t>ในเครื่อง</w:t>
+            </w:r>
+          </w:p>
+        </w:tc>
+        <w:tc>
+          <w:tcPr>
+            <w:tcW w:type="dxa" w:w="2353"/>
+            <w:shd w:fill="F4F7FB" w:val="clear"/>
+          </w:tcPr>
+          <w:p>
+            <w:pPr>
+              <w:spacing w:after="0"/>
+            </w:pPr>
+            <w:r/>
+            <w:r>
+              <w:rPr>
+                <w:rFonts w:ascii="TH Sarabun New" w:hAnsi="TH Sarabun New" w:cs="TH Sarabun New" w:eastAsia="TH Sarabun New"/>
+                <w:b w:val="0"/>
+                <w:color w:val="1F2A37"/>
+                <w:sz w:val="24"/>
+              </w:rPr>
+              <w:t>Anthropic key · ไม่ต้อง seed ใหม่</w:t>
+            </w:r>
+          </w:p>
+        </w:tc>
+      </w:tr>
+      <w:tr>
+        <w:tc>
+          <w:tcPr>
+            <w:tcW w:type="dxa" w:w="2353"/>
+            <w:shd w:fill="FFFFFF" w:val="clear"/>
+          </w:tcPr>
+          <w:p>
+            <w:pPr>
+              <w:spacing w:after="0"/>
+            </w:pPr>
+            <w:r/>
+            <w:r>
+              <w:rPr>
+                <w:rFonts w:ascii="TH Sarabun New" w:hAnsi="TH Sarabun New" w:cs="TH Sarabun New" w:eastAsia="TH Sarabun New"/>
+                <w:b w:val="0"/>
+                <w:color w:val="1F2A37"/>
+                <w:sz w:val="24"/>
+              </w:rPr>
+              <w:t>Claude + OpenAI embeddings</w:t>
+            </w:r>
+          </w:p>
+        </w:tc>
+        <w:tc>
+          <w:tcPr>
+            <w:tcW w:type="dxa" w:w="2353"/>
+            <w:shd w:fill="FFFFFF" w:val="clear"/>
+          </w:tcPr>
+          <w:p>
+            <w:pPr>
+              <w:spacing w:after="0"/>
+            </w:pPr>
+            <w:r/>
+            <w:r>
+              <w:rPr>
+                <w:rFonts w:ascii="TH Sarabun New" w:hAnsi="TH Sarabun New" w:cs="TH Sarabun New" w:eastAsia="TH Sarabun New"/>
+                <w:b w:val="0"/>
+                <w:color w:val="1F2A37"/>
+                <w:sz w:val="24"/>
+              </w:rPr>
+              <w:t>Claude</w:t>
+            </w:r>
+          </w:p>
+        </w:tc>
+        <w:tc>
+          <w:tcPr>
+            <w:tcW w:type="dxa" w:w="2353"/>
+            <w:shd w:fill="FFFFFF" w:val="clear"/>
+          </w:tcPr>
+          <w:p>
+            <w:pPr>
+              <w:spacing w:after="0"/>
+            </w:pPr>
+            <w:r/>
+            <w:r>
+              <w:rPr>
+                <w:rFonts w:ascii="TH Sarabun New" w:hAnsi="TH Sarabun New" w:cs="TH Sarabun New" w:eastAsia="TH Sarabun New"/>
+                <w:b w:val="0"/>
+                <w:color w:val="1F2A37"/>
+                <w:sz w:val="24"/>
+              </w:rPr>
+              <w:t>OpenAI</w:t>
+            </w:r>
+          </w:p>
+        </w:tc>
+        <w:tc>
+          <w:tcPr>
+            <w:tcW w:type="dxa" w:w="2353"/>
+            <w:shd w:fill="FFFFFF" w:val="clear"/>
+          </w:tcPr>
+          <w:p>
+            <w:pPr>
+              <w:spacing w:after="0"/>
+            </w:pPr>
+            <w:r/>
+            <w:r>
+              <w:rPr>
+                <w:rFonts w:ascii="TH Sarabun New" w:hAnsi="TH Sarabun New" w:cs="TH Sarabun New" w:eastAsia="TH Sarabun New"/>
+                <w:b w:val="0"/>
+                <w:color w:val="1F2A37"/>
+                <w:sz w:val="24"/>
+              </w:rPr>
+              <w:t>ต้อง seed_raw_docs หลังเปลี่ยนฝังเวกเตอร์</w:t>
             </w:r>
           </w:p>
         </w:tc>
@@ -10117,7 +10849,7 @@
           <w:color w:val="5B6775"/>
           <w:sz w:val="24"/>
         </w:rPr>
-        <w:t>ภาพที่ 15  ผล Vitest — 29 ไฟล์ 122 เคส ผ่าน</w:t>
+        <w:t>ภาพที่ 15  ผล Vitest — 30 ไฟล์ 128 เคส ผ่าน</w:t>
       </w:r>
     </w:p>
     <w:p>
@@ -10171,7 +10903,7 @@
           <w:color w:val="5B6775"/>
           <w:sz w:val="24"/>
         </w:rPr>
-        <w:t>ภาพที่ 16  ผล pytest — 1448 ผ่าน, 1 ข้าม, 10 เคส live_llm ไม่รัน</w:t>
+        <w:t>ภาพที่ 16  ผล pytest — 1448 ผ่าน (+ live_llm 10 เมื่อเปิด LM Studio)</w:t>
       </w:r>
     </w:p>
     <w:p>
@@ -10365,7 +11097,7 @@
                 <w:color w:val="1F2A37"/>
                 <w:sz w:val="24"/>
               </w:rPr>
-              <w:t>29 ไฟล์ / 122 เคส ผ่าน ใน 77.43 วินาที</w:t>
+              <w:t>30 ไฟล์ / 128 เคส ผ่าน</w:t>
             </w:r>
           </w:p>
         </w:tc>
@@ -10409,7 +11141,7 @@
                 <w:color w:val="1F2A37"/>
                 <w:sz w:val="24"/>
               </w:rPr>
-              <w:t>python -m pytest -m "not live_llm" --hypothesis-profile=coverage</w:t>
+              <w:t>python -m pytest -m "not live_llm"</w:t>
             </w:r>
           </w:p>
         </w:tc>
@@ -10430,7 +11162,137 @@
                 <w:color w:val="1F2A37"/>
                 <w:sz w:val="24"/>
               </w:rPr>
-              <w:t>1448 ผ่าน · 1 ข้าม · 10 ไม่รัน (live_llm) ใน 3:34 นาที</w:t>
+              <w:t>1448 ผ่าน · 1 ข้าม · 10 ไม่รัน (live_llm)</w:t>
+            </w:r>
+          </w:p>
+        </w:tc>
+      </w:tr>
+      <w:tr>
+        <w:tc>
+          <w:tcPr>
+            <w:tcW w:type="dxa" w:w="3137"/>
+            <w:shd w:fill="FFFFFF" w:val="clear"/>
+          </w:tcPr>
+          <w:p>
+            <w:pPr>
+              <w:spacing w:after="0"/>
+            </w:pPr>
+            <w:r/>
+            <w:r>
+              <w:rPr>
+                <w:rFonts w:ascii="TH Sarabun New" w:hAnsi="TH Sarabun New" w:cs="TH Sarabun New" w:eastAsia="TH Sarabun New"/>
+                <w:b w:val="0"/>
+                <w:color w:val="1F2A37"/>
+                <w:sz w:val="24"/>
+              </w:rPr>
+              <w:t>Backend live LLM</w:t>
+            </w:r>
+          </w:p>
+        </w:tc>
+        <w:tc>
+          <w:tcPr>
+            <w:tcW w:type="dxa" w:w="3137"/>
+            <w:shd w:fill="FFFFFF" w:val="clear"/>
+          </w:tcPr>
+          <w:p>
+            <w:pPr>
+              <w:spacing w:after="0"/>
+            </w:pPr>
+            <w:r/>
+            <w:r>
+              <w:rPr>
+                <w:rFonts w:ascii="TH Sarabun New" w:hAnsi="TH Sarabun New" w:cs="TH Sarabun New" w:eastAsia="TH Sarabun New"/>
+                <w:b w:val="0"/>
+                <w:color w:val="1F2A37"/>
+                <w:sz w:val="24"/>
+              </w:rPr>
+              <w:t>python -m pytest -m live_llm</w:t>
+            </w:r>
+          </w:p>
+        </w:tc>
+        <w:tc>
+          <w:tcPr>
+            <w:tcW w:type="dxa" w:w="3137"/>
+            <w:shd w:fill="FFFFFF" w:val="clear"/>
+          </w:tcPr>
+          <w:p>
+            <w:pPr>
+              <w:spacing w:after="0"/>
+            </w:pPr>
+            <w:r/>
+            <w:r>
+              <w:rPr>
+                <w:rFonts w:ascii="TH Sarabun New" w:hAnsi="TH Sarabun New" w:cs="TH Sarabun New" w:eastAsia="TH Sarabun New"/>
+                <w:b w:val="0"/>
+                <w:color w:val="1F2A37"/>
+                <w:sz w:val="24"/>
+              </w:rPr>
+              <w:t>10 ผ่าน (LM Studio :1234)</w:t>
+            </w:r>
+          </w:p>
+        </w:tc>
+      </w:tr>
+      <w:tr>
+        <w:tc>
+          <w:tcPr>
+            <w:tcW w:type="dxa" w:w="3137"/>
+            <w:shd w:fill="F4F7FB" w:val="clear"/>
+          </w:tcPr>
+          <w:p>
+            <w:pPr>
+              <w:spacing w:after="0"/>
+            </w:pPr>
+            <w:r/>
+            <w:r>
+              <w:rPr>
+                <w:rFonts w:ascii="TH Sarabun New" w:hAnsi="TH Sarabun New" w:cs="TH Sarabun New" w:eastAsia="TH Sarabun New"/>
+                <w:b w:val="0"/>
+                <w:color w:val="1F2A37"/>
+                <w:sz w:val="24"/>
+              </w:rPr>
+              <w:t>E2E headed</w:t>
+            </w:r>
+          </w:p>
+        </w:tc>
+        <w:tc>
+          <w:tcPr>
+            <w:tcW w:type="dxa" w:w="3137"/>
+            <w:shd w:fill="F4F7FB" w:val="clear"/>
+          </w:tcPr>
+          <w:p>
+            <w:pPr>
+              <w:spacing w:after="0"/>
+            </w:pPr>
+            <w:r/>
+            <w:r>
+              <w:rPr>
+                <w:rFonts w:ascii="TH Sarabun New" w:hAnsi="TH Sarabun New" w:cs="TH Sarabun New" w:eastAsia="TH Sarabun New"/>
+                <w:b w:val="0"/>
+                <w:color w:val="1F2A37"/>
+                <w:sz w:val="24"/>
+              </w:rPr>
+              <w:t>npm run test:e2e:headed</w:t>
+            </w:r>
+          </w:p>
+        </w:tc>
+        <w:tc>
+          <w:tcPr>
+            <w:tcW w:type="dxa" w:w="3137"/>
+            <w:shd w:fill="F4F7FB" w:val="clear"/>
+          </w:tcPr>
+          <w:p>
+            <w:pPr>
+              <w:spacing w:after="0"/>
+            </w:pPr>
+            <w:r/>
+            <w:r>
+              <w:rPr>
+                <w:rFonts w:ascii="TH Sarabun New" w:hAnsi="TH Sarabun New" w:cs="TH Sarabun New" w:eastAsia="TH Sarabun New"/>
+                <w:b w:val="0"/>
+                <w:color w:val="1F2A37"/>
+                <w:sz w:val="24"/>
+              </w:rPr>
+              <w:t>15 ผ่าน · UI มองเห็นได้ ~3.1 นาที</w:t>
             </w:r>
           </w:p>
         </w:tc>

</xml_diff>

<commit_message>
Add sequential Phase 2/3 drafting chat and resolve draft-chat Sonar findings.
Keep fact-slot intake conversational, auto-draft TOR sections with intake context on edits, and give live embedding ingest enough time under real LM Studio load.
</commit_message>
<xml_diff>
--- a/Discussions/19-APPLICATION_OPERATING_REPORT.docx
+++ b/Discussions/19-APPLICATION_OPERATING_REPORT.docx
@@ -55,7 +55,7 @@
           <w:color w:val="5B6775"/>
           <w:sz w:val="28"/>
         </w:rPr>
-        <w:t>เวอร์ชัน 0.2.3  ·  วันที่ 20 สิงหาคม 2026 (พ.ศ. 2569)</w:t>
+        <w:t>เวอร์ชัน 0.2.3  ·  วันที่ 21 สิงหาคม 2026 (พ.ศ. 2569)</w:t>
       </w:r>
     </w:p>
     <w:p>
@@ -70,7 +70,7 @@
           <w:color w:val="1F2A37"/>
           <w:sz w:val="28"/>
         </w:rPr>
-        <w:t>แหล่งความจริง: โค้ดใน app/frontend และ app/backend รวมผล unit tests ที่รันจริงวันเดียวกัน (Vitest 128 ผ่าน, pytest 1448 + live_llm 10, Playwright headed 15) เอกสารนี้เป็นฉบับส่งออกของ Discussions/19-APPLICATION_OPERATING_REPORT.md</w:t>
+        <w:t>แหล่งความจริง: โค้ดใน app/frontend และ app/backend รวมผล unit tests ที่รันจริงวันเดียวกัน (Vitest 167 ผ่าน, pytest 1500 + live_llm 14, Playwright headed 20 · พิมพ์ช้า + LM Studio จริง) เอกสารนี้เป็นฉบับส่งออกของ Discussions/19-APPLICATION_OPERATING_REPORT.md</w:t>
       </w:r>
     </w:p>
     <w:p>
@@ -504,7 +504,7 @@
                 <w:color w:val="1F2A37"/>
                 <w:sz w:val="24"/>
               </w:rPr>
-              <w:t>Vitest 128 · pytest 1448 + live_llm 10 · Playwright headed 15</w:t>
+              <w:t>Vitest 167 · pytest 1500 + live_llm 14 · Playwright headed 20 · cov 86%/87.09%</w:t>
             </w:r>
           </w:p>
         </w:tc>
@@ -1463,7 +1463,7 @@
       <w:r>
         <w:drawing>
           <wp:inline xmlns:a="http://schemas.openxmlformats.org/drawingml/2006/main" xmlns:pic="http://schemas.openxmlformats.org/drawingml/2006/picture">
-            <wp:extent cx="5760000" cy="3600000"/>
+            <wp:extent cx="5760000" cy="7033263"/>
             <wp:docPr id="3" name="Picture 3"/>
             <wp:cNvGraphicFramePr>
               <a:graphicFrameLocks noChangeAspect="1"/>
@@ -1484,7 +1484,7 @@
                   <pic:spPr>
                     <a:xfrm>
                       <a:off x="0" y="0"/>
-                      <a:ext cx="5760000" cy="3600000"/>
+                      <a:ext cx="5760000" cy="7033263"/>
                     </a:xfrm>
                     <a:prstGeom prst="rect"/>
                   </pic:spPr>
@@ -5431,7 +5431,7 @@
       <w:r>
         <w:drawing>
           <wp:inline xmlns:a="http://schemas.openxmlformats.org/drawingml/2006/main" xmlns:pic="http://schemas.openxmlformats.org/drawingml/2006/picture">
-            <wp:extent cx="5760000" cy="9648505"/>
+            <wp:extent cx="5760000" cy="3600000"/>
             <wp:docPr id="5" name="Picture 5"/>
             <wp:cNvGraphicFramePr>
               <a:graphicFrameLocks noChangeAspect="1"/>
@@ -5452,7 +5452,7 @@
                   <pic:spPr>
                     <a:xfrm>
                       <a:off x="0" y="0"/>
-                      <a:ext cx="5760000" cy="9648505"/>
+                      <a:ext cx="5760000" cy="3600000"/>
                     </a:xfrm>
                     <a:prstGeom prst="rect"/>
                   </pic:spPr>
@@ -5485,7 +5485,7 @@
       <w:r>
         <w:drawing>
           <wp:inline xmlns:a="http://schemas.openxmlformats.org/drawingml/2006/main" xmlns:pic="http://schemas.openxmlformats.org/drawingml/2006/picture">
-            <wp:extent cx="5760000" cy="7110063"/>
+            <wp:extent cx="5760000" cy="5994442"/>
             <wp:docPr id="6" name="Picture 6"/>
             <wp:cNvGraphicFramePr>
               <a:graphicFrameLocks noChangeAspect="1"/>
@@ -5506,7 +5506,7 @@
                   <pic:spPr>
                     <a:xfrm>
                       <a:off x="0" y="0"/>
-                      <a:ext cx="5760000" cy="7110063"/>
+                      <a:ext cx="5760000" cy="5994442"/>
                     </a:xfrm>
                     <a:prstGeom prst="rect"/>
                   </pic:spPr>
@@ -6693,7 +6693,7 @@
       <w:r>
         <w:drawing>
           <wp:inline xmlns:a="http://schemas.openxmlformats.org/drawingml/2006/main" xmlns:pic="http://schemas.openxmlformats.org/drawingml/2006/picture">
-            <wp:extent cx="5760000" cy="4478653"/>
+            <wp:extent cx="5760000" cy="3600000"/>
             <wp:docPr id="13" name="Picture 13"/>
             <wp:cNvGraphicFramePr>
               <a:graphicFrameLocks noChangeAspect="1"/>
@@ -6714,7 +6714,7 @@
                   <pic:spPr>
                     <a:xfrm>
                       <a:off x="0" y="0"/>
-                      <a:ext cx="5760000" cy="4478653"/>
+                      <a:ext cx="5760000" cy="3600000"/>
                     </a:xfrm>
                     <a:prstGeom prst="rect"/>
                   </pic:spPr>
@@ -6747,7 +6747,7 @@
       <w:r>
         <w:drawing>
           <wp:inline xmlns:a="http://schemas.openxmlformats.org/drawingml/2006/main" xmlns:pic="http://schemas.openxmlformats.org/drawingml/2006/picture">
-            <wp:extent cx="5760000" cy="5925726"/>
+            <wp:extent cx="5760000" cy="7752758"/>
             <wp:docPr id="14" name="Picture 14"/>
             <wp:cNvGraphicFramePr>
               <a:graphicFrameLocks noChangeAspect="1"/>
@@ -6768,7 +6768,7 @@
                   <pic:spPr>
                     <a:xfrm>
                       <a:off x="0" y="0"/>
-                      <a:ext cx="5760000" cy="5925726"/>
+                      <a:ext cx="5760000" cy="7752758"/>
                     </a:xfrm>
                     <a:prstGeom prst="rect"/>
                   </pic:spPr>
@@ -10795,7 +10795,7 @@
           <w:color w:val="1F2A37"/>
           <w:sz w:val="28"/>
         </w:rPr>
-        <w:t>รันเมื่อ 20 สิงหาคม 2026 บนเครื่องเดียวกันกับรายงานนี้</w:t>
+        <w:t>รันเมื่อ 21 สิงหาคม 2026 บนเครื่องเดียวกันกับรายงานนี้</w:t>
       </w:r>
     </w:p>
     <w:p>
@@ -10849,7 +10849,7 @@
           <w:color w:val="5B6775"/>
           <w:sz w:val="24"/>
         </w:rPr>
-        <w:t>ภาพที่ 15  ผล Vitest — 30 ไฟล์ 128 เคส ผ่าน</w:t>
+        <w:t>ภาพที่ 15  ผล Vitest — 39 ไฟล์ 167 เคส ผ่าน</w:t>
       </w:r>
     </w:p>
     <w:p>
@@ -10903,7 +10903,7 @@
           <w:color w:val="5B6775"/>
           <w:sz w:val="24"/>
         </w:rPr>
-        <w:t>ภาพที่ 16  ผล pytest — 1448 ผ่าน (+ live_llm 10 เมื่อเปิด LM Studio)</w:t>
+        <w:t>ภาพที่ 16  ผล pytest — 1500 ผ่าน + live_llm 14</w:t>
       </w:r>
     </w:p>
     <w:p>
@@ -11097,7 +11097,7 @@
                 <w:color w:val="1F2A37"/>
                 <w:sz w:val="24"/>
               </w:rPr>
-              <w:t>30 ไฟล์ / 128 เคส ผ่าน</w:t>
+              <w:t>39 ไฟล์ / 167 เคส ผ่าน</w:t>
             </w:r>
           </w:p>
         </w:tc>
@@ -11162,7 +11162,7 @@
                 <w:color w:val="1F2A37"/>
                 <w:sz w:val="24"/>
               </w:rPr>
-              <w:t>1448 ผ่าน · 1 ข้าม · 10 ไม่รัน (live_llm)</w:t>
+              <w:t>1500 ผ่าน · 0 ข้าม · 86% cov</w:t>
             </w:r>
           </w:p>
         </w:tc>
@@ -11227,7 +11227,7 @@
                 <w:color w:val="1F2A37"/>
                 <w:sz w:val="24"/>
               </w:rPr>
-              <w:t>10 ผ่าน (LM Studio :1234)</w:t>
+              <w:t>14 ผ่าน (LM Studio :1234) รวม realistic workflow</w:t>
             </w:r>
           </w:p>
         </w:tc>
@@ -11292,7 +11292,7 @@
                 <w:color w:val="1F2A37"/>
                 <w:sz w:val="24"/>
               </w:rPr>
-              <w:t>15 ผ่าน · UI มองเห็นได้ ~3.1 นาที</w:t>
+              <w:t>20 ผ่าน · พิมพ์ช้า + LM Studio จริง + realistic-flow</w:t>
             </w:r>
           </w:p>
         </w:tc>
@@ -11315,7 +11315,7 @@
                 <w:color w:val="1F2A37"/>
                 <w:sz w:val="24"/>
               </w:rPr>
-              <w:t>E2E (อ้างอิง 19 ส.ค.)</w:t>
+              <w:t>Guide + reports</w:t>
             </w:r>
           </w:p>
         </w:tc>
@@ -11336,7 +11336,7 @@
                 <w:color w:val="1F2A37"/>
                 <w:sz w:val="24"/>
               </w:rPr>
-              <w:t>npm run test:e2e</w:t>
+              <w:t>npm run test:e2e:guide / reports</w:t>
             </w:r>
           </w:p>
         </w:tc>
@@ -11357,7 +11357,7 @@
                 <w:color w:val="1F2A37"/>
                 <w:sz w:val="24"/>
               </w:rPr>
-              <w:t>15 ผ่าน — ดู 18-TEST_EVIDENCE.md</w:t>
+              <w:t>3 + 3 ผ่าน — ดู 18-TEST_EVIDENCE.md</w:t>
             </w:r>
           </w:p>
         </w:tc>

</xml_diff>